<commit_message>
Expand seminar to full length with verified new sources per instructions
- Seminar: double line spacing matching the sample's format; new general
  evidence section with per-proof reasoning; four-madhhab positions on
  death signs and the unstable-life takhrij, cited to the course's
  approved fiqh books; history expanded (Copenhagen 1952, Mollaret &
  Goulon, majma journal papers); fourth supporting fatwa (Jordanian
  Iftaa Council decision 117, quoted) and Egyptian Dar al-Ifta fatwa
  11622 referenced; 100 footnotes.
- Research plan: previous studies now 17 Arabic + 10 foreign = 27, all
  verified (added al-Arran 2023 Babylon Center journal, AJRSP 31/2021);
  fatwa chapter lists four supporting fatwas; sources list extended.
- Both self-assessment forms updated to match.

Co-Authored-By: Claude Fable 5 <noreply@anthropic.com>
Claude-Session: https://claude.ai/code/session_01ESPDZE2KAqBUfzv5HLVvG7
</commit_message>
<xml_diff>
--- a/seminar/Abd Almahdi Dahla 212684527 - Evaluation Rubric.docx
+++ b/seminar/Abd Almahdi Dahla 212684527 - Evaluation Rubric.docx
@@ -567,7 +567,7 @@
                 <w:szCs w:val="24"/>
                 <w:rtl/>
               </w:rPr>
-              <w:t xml:space="preserve">- الالتزام بالعدد المطلوب (20 دراسة على الأقل): عدد الدراسات بالعربية (15)، بالأجنبية (10). (علامة)</w:t>
+              <w:t xml:space="preserve">- الالتزام بالعدد المطلوب (20 دراسة على الأقل): عدد الدراسات بالعربية (17)، بالأجنبية (10). (علامة)</w:t>
             </w:r>
           </w:p>
         </w:tc>
@@ -613,7 +613,7 @@
                 <w:szCs w:val="24"/>
                 <w:rtl/>
               </w:rPr>
-              <w:t xml:space="preserve">المجموع 25 دراسة: 15 دراسة عربية و10 دراسات أجنبية، كلها متعلقة مباشرة بموضوع البحث.</w:t>
+              <w:t xml:space="preserve">المجموع 27 دراسة: 17 دراسة عربية و10 دراسات أجنبية، كلها متعلقة مباشرة بموضوع البحث.</w:t>
             </w:r>
           </w:p>
         </w:tc>
@@ -1891,7 +1891,7 @@
                 <w:szCs w:val="24"/>
                 <w:rtl/>
               </w:rPr>
-              <w:t xml:space="preserve">تم التصويب وفق الملاحظة (نقص الفتاوى والتعقيب): ثلاث فتاوى مؤيدة (مجمع الفقه الدولي 1986، ندوة الكويت 1985، دار الإفتاء المصرية) وثلاث معارضة (مجمع الرابطة 1987، اللجنة الدائمة، ابن عثيمين)، لكل فتوى فرعان: النص/المضمون، والرد والتعقيب.</w:t>
+              <w:t xml:space="preserve">تم التصويب وفق الملاحظة (نقص الفتاوى والتعقيب): أربع فتاوى مؤيدة (مجمع الفقه الدولي 1986، ندوة الكويت 1985، دار الإفتاء المصرية رقم 11622، مجلس الإفتاء الأردني قرار 117) وثلاث معارضة (مجمع الرابطة 1987، اللجنة الدائمة، ابن عثيمين)، لكل فتوى فرعان: النص/المضمون، والرد والتعقيب.</w:t>
             </w:r>
           </w:p>
         </w:tc>

</xml_diff>

<commit_message>
Make all text black including hyperlinks and style definitions
Co-Authored-By: Claude Fable 5 <noreply@anthropic.com>
Claude-Session: https://claude.ai/code/session_01ESPDZE2KAqBUfzv5HLVvG7
</commit_message>
<xml_diff>
--- a/seminar/Abd Almahdi Dahla 212684527 - Evaluation Rubric.docx
+++ b/seminar/Abd Almahdi Dahla 212684527 - Evaluation Rubric.docx
@@ -2605,7 +2605,7 @@
     <w:next w:val="Normal"/>
     <w:qFormat/>
     <w:rPr>
-      <w:color w:val="2E74B5"/>
+      <w:color w:val="000000"/>
       <w:sz w:val="32"/>
       <w:szCs w:val="32"/>
     </w:rPr>
@@ -2616,7 +2616,7 @@
     <w:next w:val="Normal"/>
     <w:qFormat/>
     <w:rPr>
-      <w:color w:val="2E74B5"/>
+      <w:color w:val="000000"/>
       <w:sz w:val="26"/>
       <w:szCs w:val="26"/>
     </w:rPr>
@@ -2627,7 +2627,7 @@
     <w:next w:val="Normal"/>
     <w:qFormat/>
     <w:rPr>
-      <w:color w:val="1F4D78"/>
+      <w:color w:val="000000"/>
       <w:sz w:val="24"/>
       <w:szCs w:val="24"/>
     </w:rPr>
@@ -2640,7 +2640,7 @@
     <w:rPr>
       <w:i/>
       <w:iCs/>
-      <w:color w:val="2E74B5"/>
+      <w:color w:val="000000"/>
     </w:rPr>
   </w:style>
   <w:style w:type="paragraph" w:styleId="Heading5">
@@ -2649,7 +2649,7 @@
     <w:next w:val="Normal"/>
     <w:qFormat/>
     <w:rPr>
-      <w:color w:val="2E74B5"/>
+      <w:color w:val="000000"/>
     </w:rPr>
   </w:style>
   <w:style w:type="paragraph" w:styleId="Heading6">
@@ -2658,7 +2658,7 @@
     <w:next w:val="Normal"/>
     <w:qFormat/>
     <w:rPr>
-      <w:color w:val="1F4D78"/>
+      <w:color w:val="000000"/>
     </w:rPr>
   </w:style>
   <w:style w:type="paragraph" w:styleId="Strong">
@@ -2682,7 +2682,7 @@
     <w:uiPriority w:val="99"/>
     <w:unhideWhenUsed/>
     <w:rPr>
-      <w:color w:val="0563C1"/>
+      <w:color w:val="000000"/>
       <w:u w:val="single"/>
     </w:rPr>
   </w:style>

</xml_diff>